<commit_message>
docs: update summary/PPT/AGENTS for Kalman servo and deferred logging
</commit_message>
<xml_diff>
--- a/BIS时间同步技术总结.docx
+++ b/BIS时间同步技术总结.docx
@@ -261,7 +261,7 @@
         <w:pStyle w:val="ListBullet"/>
       </w:pPr>
       <w:r>
-        <w:t>接收端对每个有效 SDU 得到参考对 (tx_ts, info-&gt;ts)，估计两时钟的 offset 与 drift（ppm）；</w:t>
+        <w:t>接收端对每个有效 SDU 得到参考对 (tx_ts, info-&gt;ts)，用三状态 Kalman 估计 offset / drift / drift-rate；</w:t>
       </w:r>
     </w:p>
     <w:p>
@@ -269,7 +269,7 @@
         <w:pStyle w:val="ListBullet"/>
       </w:pPr>
       <w:r>
-        <w:t>维护映射 shared(local) = local + offset + drift 外推，把本地 GRTC 换算到发送端时间基准。</w:t>
+        <w:t>维护映射 shared(local) = local + offset + drift×age + ½·drift-rate×age²，把本地 GRTC 换算到发送端时间基准。</w:t>
       </w:r>
     </w:p>
     <w:p>
@@ -320,12 +320,12 @@
         <w:pStyle w:val="Heading2"/>
       </w:pPr>
       <w:r>
-        <w:t>3.3 时钟伺服核心（time_sync.c）</w:t>
+        <w:t>3.3 时钟伺服核心：三状态 Kalman（time_sync.c）</w:t>
       </w:r>
     </w:p>
     <w:p>
       <w:r>
-        <w:t>时钟伺服是纯软件模块，每 SDU 一次 O(1) 更新，无动态内存：</w:t>
+        <w:t>时钟伺服是纯软件模块，每 SDU 一次 O(1) 更新，无动态内存，估计状态 x = [offset(µs), drift(µs/s), drift-rate(µs/s²)]：</w:t>
       </w:r>
     </w:p>
     <w:p>
@@ -333,7 +333,7 @@
         <w:pStyle w:val="ListBullet"/>
       </w:pPr>
       <w:r>
-        <w:t>offset 测量：meas = (int32_t)(tx_ts - local_ts)。两时钟同以 1MHz 回绕，32 位有符号差天然 wrap-safe；</w:t>
+        <w:t>测量：meas = (int32_t)(tx_ts - local_ts)。两时钟同以 1MHz 回绕，32 位有符号差天然 wrap-safe，状态约束在 [-2^31, 2^31)，新息按 2^32 取模；</w:t>
       </w:r>
     </w:p>
     <w:p>
@@ -341,7 +341,7 @@
         <w:pStyle w:val="ListBullet"/>
       </w:pPr>
       <w:r>
-        <w:t>offset 估计：128 样本滑动窗口的 trimmed mean（去掉两端各 25%），1/256µs 定点，兼顾离群点鲁棒性与亚 µs 分辨率；</w:t>
+        <w:t>预测/更新：标准 3×3 协方差 Kalman，过程噪声用离散 white-noise-jerk 模型（KF_JERK_PSD）；</w:t>
       </w:r>
     </w:p>
     <w:p>
@@ -349,7 +349,7 @@
         <w:pStyle w:val="ListBullet"/>
       </w:pPr>
       <w:r>
-        <w:t>drift 估计：对窗口内样本做最小二乘线性回归求斜率，得到 ppm 漂移率（比两点斜率噪声低约一个数量级）；</w:t>
+        <w:t>抗离群：新息 |innov| &gt; 6σ（或 &gt; 100ms）直接丢弃，替代定窗的 trimmed mean；</w:t>
       </w:r>
     </w:p>
     <w:p>
@@ -357,7 +357,12 @@
         <w:pStyle w:val="ListBullet"/>
       </w:pPr>
       <w:r>
-        <w:t>漂移外推：shared_ts = local + offset + drift × age，把窗口中点时刻的 offset 外推到当前时刻，消除“陈旧误差”并覆盖 holdover。</w:t>
+        <w:t>映射：shared_ts = local + offset + drift×age + ½·drift-rate×age²，holdover 时按最后的 offset/drift/drift-rate 滑行。</w:t>
+      </w:r>
+    </w:p>
+    <w:p>
+      <w:r>
+        <w:t>相比旧的“128 样本 trimmed mean + 最小二乘”定窗方案：噪声/跟踪滞后由显式噪声模型自动折中，drift-rate 状态可跟踪温漂斜坡并改善 holdover，离群门限更严格。</w:t>
       </w:r>
     </w:p>
     <w:p>
@@ -524,7 +529,7 @@
         <w:pStyle w:val="ListBullet"/>
       </w:pPr>
       <w:r>
-        <w:t>src/iso_rx.c：SDU 解析 + 时钟伺服接入 + 统计打印；</w:t>
+        <w:t>src/iso_rx.c：SDU 解析 + 时钟伺服接入 + 链路统计；</w:t>
       </w:r>
     </w:p>
     <w:p>
@@ -532,7 +537,15 @@
         <w:pStyle w:val="ListBullet"/>
       </w:pPr>
       <w:r>
-        <w:t>src/time_sync.c / include/time_sync.h：时钟伺服核心；</w:t>
+        <w:t>src/time_sync.c / include/time_sync.h：三状态 Kalman 时钟伺服；</w:t>
+      </w:r>
+    </w:p>
+    <w:p>
+      <w:pPr>
+        <w:pStyle w:val="ListBullet"/>
+      </w:pPr>
+      <w:r>
+        <w:t>src/sync_log.c / include/sync_log.h：延迟日志（消息队列 + 低优先级线程），避免串口阻塞收发回调；</w:t>
       </w:r>
     </w:p>
     <w:p>
@@ -765,7 +778,7 @@
           </w:tcPr>
           <w:p>
             <w:r>
-              <w:t>trimmed mean 鲁棒估计</w:t>
+              <w:t>Kalman 新息门限（6σ）剔除</w:t>
             </w:r>
           </w:p>
         </w:tc>

</xml_diff>

<commit_message>
docs: document Huber gate, temperature-adaptive Q and temp sensor
</commit_message>
<xml_diff>
--- a/BIS时间同步技术总结.docx
+++ b/BIS时间同步技术总结.docx
@@ -349,7 +349,15 @@
         <w:pStyle w:val="ListBullet"/>
       </w:pPr>
       <w:r>
-        <w:t>抗离群：新息 |innov| &gt; 6σ（或 &gt; 100ms）直接丢弃，替代定窗的 trimmed mean；</w:t>
+        <w:t>温度自适应：q = KF_JERK_PSD·(1 + KF_TEMP_Q_GAIN·|dT/dt|)，每秒读片上 TEMP，温度稳定时安静、变化时敏捷；</w:t>
+      </w:r>
+    </w:p>
+    <w:p>
+      <w:pPr>
+        <w:pStyle w:val="ListBullet"/>
+      </w:pPr>
+      <w:r>
+        <w:t>抗离群：Huber 软门限，归一化新息超过 3σ 后按 nu²/C² 膨胀 R（平滑降权），仅 &gt; 100ms 的粗差直接丢弃；</w:t>
       </w:r>
     </w:p>
     <w:p>
@@ -537,7 +545,7 @@
         <w:pStyle w:val="ListBullet"/>
       </w:pPr>
       <w:r>
-        <w:t>src/time_sync.c / include/time_sync.h：三状态 Kalman 时钟伺服；</w:t>
+        <w:t>src/time_sync.c / include/time_sync.h：三状态 Kalman 时钟伺服（Huber + 温度自适应）；</w:t>
       </w:r>
     </w:p>
     <w:p>
@@ -546,6 +554,14 @@
       </w:pPr>
       <w:r>
         <w:t>src/sync_log.c / include/sync_log.h：延迟日志（消息队列 + 低优先级线程），避免串口阻塞收发回调；</w:t>
+      </w:r>
+    </w:p>
+    <w:p>
+      <w:pPr>
+        <w:pStyle w:val="ListBullet"/>
+      </w:pPr>
+      <w:r>
+        <w:t>src/temp_sensor.c：周期读取片上 TEMP，喂给时钟伺服；</w:t>
       </w:r>
     </w:p>
     <w:p>

</xml_diff>